<commit_message>
Update requirements submission1 due 27th FEB.docx
</commit_message>
<xml_diff>
--- a/documentation/rq & spec/requirements submission1 due 27th FEB.docx
+++ b/documentation/rq & spec/requirements submission1 due 27th FEB.docx
@@ -5,7 +5,13 @@
     <w:sdt>
       <w:sdtPr>
         <w:rPr>
+          <w:rFonts w:eastAsiaTheme="minorHAnsi"/>
           <w:color w:val="156082" w:themeColor="accent1"/>
+          <w:kern w:val="2"/>
+          <w:sz w:val="24"/>
+          <w:szCs w:val="24"/>
+          <w:lang w:eastAsia="en-US"/>
+          <w14:ligatures w14:val="standardContextual"/>
         </w:rPr>
         <w:id w:val="1496378791"/>
         <w:docPartObj>
@@ -15,13 +21,7 @@
       </w:sdtPr>
       <w:sdtEndPr>
         <w:rPr>
-          <w:rFonts w:eastAsiaTheme="minorHAnsi"/>
           <w:color w:val="auto"/>
-          <w:kern w:val="2"/>
-          <w:sz w:val="24"/>
-          <w:szCs w:val="24"/>
-          <w:lang w:eastAsia="en-US"/>
-          <w14:ligatures w14:val="standardContextual"/>
         </w:rPr>
       </w:sdtEndPr>
       <w:sdtContent>
@@ -689,6 +689,13 @@
         <w:t>1.3 History of the document</w:t>
       </w:r>
     </w:p>
+    <w:p>
+      <w:pPr>
+        <w:rPr>
+          <w:rFonts w:ascii="Times New Roman" w:hAnsi="Times New Roman" w:cs="Times New Roman"/>
+        </w:rPr>
+      </w:pPr>
+    </w:p>
     <w:sectPr>
       <w:pgSz w:w="11906" w:h="16838"/>
       <w:pgMar w:top="1440" w:right="1440" w:bottom="1440" w:left="1440" w:header="720" w:footer="720" w:gutter="0"/>
@@ -1304,6 +1311,7 @@
   <w:style w:type="character" w:default="1" w:styleId="DefaultParagraphFont">
     <w:name w:val="Default Paragraph Font"/>
     <w:uiPriority w:val="1"/>
+    <w:semiHidden/>
     <w:unhideWhenUsed/>
   </w:style>
   <w:style w:type="table" w:default="1" w:styleId="TableNormal">
@@ -1765,8 +1773,10 @@
   <w:rsids>
     <w:rsidRoot w:val="006553EA"/>
     <w:rsid w:val="003B5955"/>
+    <w:rsid w:val="003F6BAC"/>
     <w:rsid w:val="006553EA"/>
     <w:rsid w:val="009E1A36"/>
+    <w:rsid w:val="00CF7BAD"/>
   </w:rsids>
   <m:mathPr>
     <m:mathFont m:val="Cambria Math"/>

</xml_diff>